<commit_message>
WK5 과제·투자피칭 PPT: Place/Promotion/People 균형 보강 + PPT에도 AI Agent 비중 반영
docx: 7P의 Place·Promotion·People 세 항목에도 [보험 AI Agent]/[블록체인
자동화] 태그를 적용해 나머지 항목(Product·Price·Physical Evidence)과
균형을 맞춤.

pptx: 슬라이드10(신규 상품 11종) 제목에 "AI·블록체인"을 명시하고,
슬라이드14(비즈니스모델 5유형)의 연속성 수익 카드에 "AI Assistant·
언더라이팅 엔진 라이선스"를 B2B 온체인 API보다 앞에 명시해 AI Agent
매출원이 블록체인 매출원과 동등하게 드러나도록 보강.

Co-Authored-By: Claude Sonnet 5 <noreply@anthropic.com>
Claude-Session: https://claude.ai/code/session_01GWDw6RThqmd55xBWQoyq5w
</commit_message>
<xml_diff>
--- a/WK5_마케팅믹스_BCG매트릭스_5Layers_인슈어체인.docx
+++ b/WK5_마케팅믹스_BCG매트릭스_5Layers_인슈어체인.docx
@@ -407,7 +407,7 @@
                 <w:sz w:val="19"/>
                 <w:szCs w:val="19"/>
               </w:rPr>
-              <w:t xml:space="preserve">① 직접 채널 — 챗봇 웹앱(Flask, web_app.py)으로 고객에게 직접 상담·가입 제공, ② B2B 간접 채널 — 소형 GA·핀테크사에 API 키로 재판매(/api/partner/v1/dental/status), ③ 리퍼럴 채널 — 건강검진센터 제휴(CareLink)로 검진 직후 고객을 연결.</w:t>
+              <w:t xml:space="preserve">[보험 AI Agent] ① 직접 채널 — 챗봇 웹앱(Flask, web_app.py)으로 고객에게 직접 상담·가입 제공, ② B2B 간접 채널(AI) — AI Assistant·언더라이팅 엔진을 소형 GA·핀테크사에 API/라이선스로 재판매, ③ 리퍼럴 채널 — 건강검진센터 제휴(CareLink)로 검진 직후 고객을 연결. [블록체인 자동화] ④ B2B 간접 채널(온체인) — 온체인 데이터 조회 API를 API 키로 재판매(/api/partner/v1/dental/status).</w:t>
             </w:r>
           </w:p>
         </w:tc>
@@ -460,7 +460,7 @@
                 <w:sz w:val="19"/>
                 <w:szCs w:val="19"/>
               </w:rPr>
-              <w:t xml:space="preserve">정부지원사업(한국핀테크지원센터 디지털 금융기술 내재화 사업) 지원서·컨설팅, 손보사 1곳 PoC MOU 및 혁신금융서비스(규제샌드박스) 공동신청, 투자자·파트너 대상 피칭 자료(수익성 지표 대시보드로 증빙), 건강검진센터 제휴를 통한 리퍼럴 마케팅(검진 직후 고전환 타이밍 공략).</w:t>
+              <w:t xml:space="preserve">[보험 AI Agent] 투자자·파트너 대상 피칭 자료(AI Assistant·언더라이팅 엔진 데모 및 수익성 지표 대시보드로 증빙), 건강검진센터 제휴를 통한 리퍼럴 마케팅(CareLink, 검진 직후 고전환 타이밍 공략), 정부지원사업(한국핀테크지원센터 디지털 금융기술 내재화 사업) 지원서·컨설팅. [블록체인 자동화] 손보사 1곳 PoC MOU 및 혁신금융서비스(규제샌드박스) 공동신청.</w:t>
             </w:r>
           </w:p>
         </w:tc>
@@ -566,7 +566,7 @@
                 <w:sz w:val="19"/>
                 <w:szCs w:val="19"/>
               </w:rPr>
-              <w:t xml:space="preserve">전문 언더라이터(human_review 대기열에서 수동심사), 관리자(승인·거절·지급 최종 서명자), 플랫폼 개발팀, 건강검진센터 제휴 담당자. AI는 어디까지나 '자율실행(Agent)' 또는 '참고용 어드바이저(Human-in-the-Loop)'로 역할이 분리되어 있고, 사람이 결정권을 갖는 지점(청구 20% 초과, 중위험 보완요청 등)이 명확히 설계되어 있다.</w:t>
+              <w:t xml:space="preserve">[보험 AI Agent 거버넌스] 전문 언더라이터(human_review 대기열 — AI 교차심사에서 올라온 중위험·고위험 건을 수동심사). AI는 어디까지나 '자율실행(Agent)' 또는 '참고용 어드바이저(Human-in-the-Loop)'로 역할이 분리되어 있다. [블록체인 자동화 거버넌스] 관리자(승인·거절·지급 최종 서명자), 플랫폼 개발팀, 건강검진센터 제휴 담당자. 사람이 결정권을 갖는 지점(청구 20% 초과, 중위험 보완요청 등)이 양쪽 모두 명확히 설계되어 있다.</w:t>
             </w:r>
           </w:p>
         </w:tc>

</xml_diff>

<commit_message>
WK5 과제: Product·Price·Physical Evidence의 보험 AI Agent 내용 보강
Product에 '건강위험·신용 스코어링 엔진(로지스틱+Health-Credit)'을 3번째
AI 자산으로 추가, Price에 AI Assistant/언더라이팅 엔진의 종량제·월정액
선택형 가격 구조 설명 추가, Physical Evidence에 AUC 성능 지표·데모
시나리오 실행 로그를 AI 측 증거로 추가. 블록체인 쪽 내용은 그대로 둠.

Co-Authored-By: Claude Sonnet 5 <noreply@anthropic.com>
Claude-Session: https://claude.ai/code/session_01GWDw6RThqmd55xBWQoyq5w
</commit_message>
<xml_diff>
--- a/WK5_마케팅믹스_BCG매트릭스_5Layers_인슈어체인.docx
+++ b/WK5_마케팅믹스_BCG매트릭스_5Layers_인슈어체인.docx
@@ -301,7 +301,7 @@
                 <w:sz w:val="19"/>
                 <w:szCs w:val="19"/>
               </w:rPr>
-              <w:t xml:space="preserve">[보험 AI Agent] ① 보험상담 AI Assistant(상품추천·리밸런싱(CareLink)·부수 금융업무 3대 축, 위 참조) — 고객용 상담 엔진. ② 언더라이팅 AI 엔진(19종 자율 심사 도구 + 경계·중위험 교차심사) — 보험사 대상으로 챗봇과 분리해 단독 라이선스가 가능한 B2B 심사엔진 자산. [블록체인 자동화] ③ 블록체인 치아보험 스마트컨트랙트(청약·납입·청구·만기환급 자동집행) ④ 파라메트릭(지수형) 보험 ⑤ 온체인 데이터 조회 B2B API ⑥ 가스리스 온보딩. 치아보험은 이미 전 과정이 온체인에서 동작하는 완성 상품이며, 11개 신규 상품·고도화 기능이 같은 인프라(오라클·언더라이팅 서브에이전트·준비금 계좌)를 재사용해 추가됨.</w:t>
+              <w:t xml:space="preserve">[보험 AI Agent] ① 보험상담 AI Assistant(상품추천·리밸런싱(CareLink)·부수 금융업무 3대 축, 위 참조) — 고객용 상담 엔진. ② 언더라이팅 AI 엔진(19종 자율 심사 도구 + 경계·중위험 교차심사) — 보험사 대상으로 챗봇과 분리해 단독 라이선스가 가능한 B2B 심사엔진 자산. ③ 건강위험·신용 스코어링 엔진(로지스틱 위험예측 모델 + Health-Credit 대안 신용평가) — CareLink·언더라이팅 양쪽에서 재사용되는 핵심 모델을 독립된 데이터 상품으로도 제공 가능. [블록체인 자동화] ④ 블록체인 치아보험 스마트컨트랙트(청약·납입·청구·만기환급 자동집행) ⑤ 파라메트릭(지수형) 보험 ⑥ 온체인 데이터 조회 B2B API ⑦ 가스리스 온보딩. 치아보험은 이미 전 과정이 온체인에서 동작하는 완성 상품이며, 11개 신규 상품·고도화 기능이 같은 인프라(오라클·언더라이팅 서브에이전트·준비금 계좌)를 재사용해 추가됨.</w:t>
             </w:r>
           </w:p>
         </w:tc>
@@ -354,7 +354,7 @@
                 <w:sz w:val="19"/>
                 <w:szCs w:val="19"/>
               </w:rPr>
-              <w:t xml:space="preserve">보험료 자체는 기존 보험업계 요율 체계를 따르므로 가격 경쟁이 아니라 '비용구조 혁신'이 가격 전략의 핵심이다. [보험 AI Agent 기여분] 가입심사 93%↓(언더라이팅 19종 서브에이전트가 설계사·언더라이터 인건비 대체), 고객문의대응 93%↓(챗봇 상담이 콜센터 상담원 대체). [블록체인 자동화 기여분] 소액청구심사 92%↓, 결제정산 98%↓, 재보험조달 67%↓(평균 약 89% 절감). 이를 근거로 AI Assistant/언더라이팅 엔진 라이선스료 + 온체인 API 월정산·재보험풀 AUM 수수료 등 가치기반 가격을 보험사·파트너사에 부과한다.</w:t>
+              <w:t xml:space="preserve">보험료 자체는 기존 보험업계 요율 체계를 따르므로 가격 경쟁이 아니라 '비용구조 혁신'이 가격 전략의 핵심이다. [보험 AI Agent 기여분] 가입심사 93%↓(언더라이팅 19종 서브에이전트가 설계사·언더라이터 인건비 대체), 고객문의대응 93%↓(챗봇 상담이 콜센터 상담원 대체). AI Assistant·언더라이팅 엔진은 호출량 기반 API 과금 또는 월정액 SaaS 중 선택 가능한 가격 구조로 설계해, 정액 라이선스 성격인 블록체인 상품보다 파트너사의 초기 도입 장벽을 낮춘다 — 소규모 GA는 종량제로 시작해 호출량이 늘면 월정액으로 전환하는 식. [블록체인 자동화 기여분] 소액청구심사 92%↓, 결제정산 98%↓, 재보험조달 67%↓(평균 약 89% 절감). 이를 근거로 AI Assistant/언더라이팅 엔진 라이선스료 + 온체인 API 월정산·재보험풀 AUM 수수료 등 가치기반 가격을 보험사·파트너사에 부과한다.</w:t>
             </w:r>
           </w:p>
         </w:tc>
@@ -619,7 +619,7 @@
                 <w:sz w:val="19"/>
                 <w:szCs w:val="19"/>
               </w:rPr>
-              <w:t xml:space="preserve">[보험 AI Agent] 구조화 출력 로그(tier는 AI가 판단, route는 코드가 결정하는 기록), 경계·중위험 교차심사 기록(cross_review — 어느 리뷰어가 어떤 사유로 상향했는지), AI 어드바이저 의견이 담긴 Slack 로그. [블록체인 자동화] 관리자 대시보드의 손해율·사업비율·합산비율 실시간 노출, 온체인 투명 기록(고객·보험사가 동일 데이터 실시간 조회), PDF 증권서류, 167개 이상 통과한 Hardhat 단위테스트 — 무형 서비스의 신뢰를 보강하는 유형적 증거 역할을 한다.</w:t>
+              <w:t xml:space="preserve">[보험 AI Agent] 구조화 출력 로그(tier는 AI가 판단, route는 코드가 결정하는 기록), 경계·중위험 교차심사 기록(cross_review — 어느 리뷰어가 어떤 사유로 상향했는지), AI 어드바이저 의견이 담긴 Slack 로그, 건강위험 예측모델의 AUC≈0.78 성능 지표(모델 신뢰도를 수치로 공개), 데모 시나리오(가상 시나리오) 실행 로그 — 상담·심사 품질을 직접 보여주는 증거. [블록체인 자동화] 관리자 대시보드의 손해율·사업비율·합산비율 실시간 노출, 온체인 투명 기록(고객·보험사가 동일 데이터 실시간 조회), PDF 증권서류, 167개 이상 통과한 Hardhat 단위테스트 — 무형 서비스의 신뢰를 보강하는 유형적 증거 역할을 한다.</w:t>
             </w:r>
           </w:p>
         </w:tc>

</xml_diff>